<commit_message>
fix(review): address CodeRabbit feedback on report dynamic data, plot titles, and pre-checks
</commit_message>
<xml_diff>
--- a/docs/BaoCao_Tuan7.docx
+++ b/docs/BaoCao_Tuan7.docx
@@ -370,7 +370,7 @@
           <w:rFonts w:ascii="Times New Roman" w:hAnsi="Times New Roman"/>
           <w:sz w:val="22"/>
         </w:rPr>
-        <w:t>Thực hiện đo đạc thực nghiệm độc lập M=10 lần trên Profile chuẩn P1 (nam, 22 tuổi, duy trì cân nặng), phân tích định lượng độ lệch dinh dưỡng, tỷ lệ vi phạm ràng buộc và tốc độ hội tụ.</w:t>
+        <w:t>Thực hiện đo đạc thực nghiệm độc lập M lần trên Profile chuẩn P1 (nam, 22 tuổi, duy trì cân nặng), phân tích định lượng độ lệch dinh dưỡng, tỷ lệ vi phạm ràng buộc và tốc độ hội tụ.</w:t>
       </w:r>
     </w:p>
     <w:p>
@@ -621,7 +621,7 @@
           <w:color w:val="232323"/>
           <w:sz w:val="22"/>
         </w:rPr>
-        <w:t>Hồ sơ người dùng chuẩn P1 được thiết lập đại diện cho đối tượng nam thanh niên trưởng thành, thể trạng bình thường:</w:t>
+        <w:t>Hồ sơ người dùng chuẩn P1 được thiết lập đại diện cho đối tượng nam thanh niên trưởng thành:</w:t>
       </w:r>
     </w:p>
     <w:p>
@@ -642,7 +642,7 @@
           <w:rFonts w:ascii="Times New Roman" w:hAnsi="Times New Roman"/>
           <w:sz w:val="22"/>
         </w:rPr>
-        <w:t>Tên: Duy, Tuổi: 22, Giới tính: Nam, Chiều cao: 170.0 cm, Cân nặng: 65.0 kg.</w:t>
+        <w:t>Tên: Duy, Tuổi: 22, Giới tính: Male, Chiều cao: 170.0 cm, Cân nặng: 65.0 kg.</w:t>
       </w:r>
     </w:p>
     <w:p>
@@ -663,7 +663,7 @@
           <w:rFonts w:ascii="Times New Roman" w:hAnsi="Times New Roman"/>
           <w:sz w:val="22"/>
         </w:rPr>
-        <w:t>Vận động vừa (MODERATE, hệ số 1.55), Mục tiêu: Duy trì cân nặng (MAINTAIN).</w:t>
+        <w:t>Vận động: MODERATE, Mục tiêu: MAINTAIN.</w:t>
       </w:r>
     </w:p>
     <w:p>
@@ -684,7 +684,7 @@
           <w:rFonts w:ascii="Times New Roman" w:hAnsi="Times New Roman"/>
           <w:sz w:val="22"/>
         </w:rPr>
-        <w:t>BMR (Mifflin-St Jeor) = 1607.5 kcal; TDEE = 2491.6 kcal; Năng lượng mục tiêu = 2491.6 kcal/ngày.</w:t>
+        <w:t>Năng lượng khuyến nghị: 2491.6 kcal/ngày.</w:t>
       </w:r>
     </w:p>
     <w:p>
@@ -705,7 +705,7 @@
           <w:rFonts w:ascii="Times New Roman" w:hAnsi="Times New Roman"/>
           <w:sz w:val="22"/>
         </w:rPr>
-        <w:t>Protein: 124.6 g (20% calo); Carbohydrate: 311.5 g (50% calo); Chất béo: 83.1 g (30% calo); Chất xơ: 38.0 g/ngày.</w:t>
+        <w:t>Protein: 124.6 g; Carbs: 311.5 g; Fat: 83.1 g; Fiber: 38.0 g/ngày.</w:t>
       </w:r>
     </w:p>
     <w:p>
@@ -726,7 +726,7 @@
           <w:rFonts w:ascii="Times New Roman" w:hAnsi="Times New Roman"/>
           <w:sz w:val="22"/>
         </w:rPr>
-        <w:t>Sáng: 2 món, Trưa: 2 món, Tối: 2 món, Phụ: 2 món. Tổng cộng: 8 món (dim = 8).</w:t>
+        <w:t>Sáng: 2 món, Trưa: 2 món, Tối: 2 món, Phụ: 2 món. Tổng: 8 món.</w:t>
       </w:r>
     </w:p>
     <w:p>
@@ -741,23 +741,7 @@
           <w:color w:val="232323"/>
           <w:sz w:val="23"/>
         </w:rPr>
-        <w:t>4.2. Danh sách món ăn cố định (Seed Sampler = 7000)</w:t>
-      </w:r>
-    </w:p>
-    <w:p>
-      <w:pPr>
-        <w:spacing w:before="0" w:after="80" w:line="276" w:lineRule="auto"/>
-        <w:jc w:val="both"/>
-      </w:pPr>
-      <w:r>
-        <w:rPr>
-          <w:rFonts w:ascii="Times New Roman" w:hAnsi="Times New Roman"/>
-          <w:b w:val="0"/>
-          <w:i w:val="0"/>
-          <w:color w:val="232323"/>
-          <w:sz w:val="22"/>
-        </w:rPr>
-        <w:t>Để việc so sánh giữa DBO và IDBO hoàn toàn khách quan, danh sách món ăn được cố định cho mọi lần chạy bằng cách lấy mẫu từ cơ sở dữ liệu `merged_food_nutrition.csv` với seed chọn món bằng 7000. Tám món ăn được lựa chọn chi tiết như sau:</w:t>
+        <w:t>4.2. Danh sách món ăn được chọn ngẫu nhiên hợp lệ</w:t>
       </w:r>
     </w:p>
     <w:tbl>
@@ -1017,7 +1001,7 @@
                 <w:rFonts w:ascii="Times New Roman" w:hAnsi="Times New Roman"/>
                 <w:sz w:val="19"/>
               </w:rPr>
-              <w:t>Cereals ready-to-eat, wheat and bran, presweetened</w:t>
+              <w:t>Cereals ready-to-eat, wheat and bran, presweetened with nuts and fruits</w:t>
             </w:r>
           </w:p>
         </w:tc>
@@ -1270,7 +1254,7 @@
                 <w:rFonts w:ascii="Times New Roman" w:hAnsi="Times New Roman"/>
                 <w:sz w:val="19"/>
               </w:rPr>
-              <w:t>APPLE CRANBERRY PECAN CHICKEN SALAD</w:t>
+              <w:t>APPLE CRANBERRY PECAN CHICKEN SALAD, APPLE CRANBERRY PECAN CHICKEN</w:t>
             </w:r>
           </w:p>
         </w:tc>
@@ -1521,7 +1505,7 @@
                 <w:rFonts w:ascii="Times New Roman" w:hAnsi="Times New Roman"/>
                 <w:sz w:val="19"/>
               </w:rPr>
-              <w:t>ANTIOXIDANT BLEND HARVEST BERRIES ORGANIC</w:t>
+              <w:t>ANTIOXIDANT BLEND HARVEST BERRIES ORGANIC STRAWBERRIES, BLACKBERRIES &amp; BLUEBERRIES, ANTIOXIDANT BLEND HARVEST BERRIES</w:t>
             </w:r>
           </w:p>
         </w:tc>
@@ -1559,7 +1543,7 @@
           <w:color w:val="5A5A5A"/>
           <w:sz w:val="19"/>
         </w:rPr>
-        <w:t>Bảng 4.1. Danh mục 8 món ăn cố định cho Profile P1 (Seed sampler = 7000)</w:t>
+        <w:t>Bảng 4.1. Danh mục các món ăn được lựa chọn cho Profile P1</w:t>
       </w:r>
     </w:p>
     <w:p>
@@ -1658,7 +1642,7 @@
           <w:rFonts w:ascii="Times New Roman" w:hAnsi="Times New Roman"/>
           <w:sz w:val="22"/>
         </w:rPr>
-        <w:t>10 runs với các seed khởi tạo từ 7001 đến 7010.</w:t>
+        <w:t>10 runs.</w:t>
       </w:r>
     </w:p>
     <w:p>
@@ -1679,7 +1663,7 @@
           <w:rFonts w:ascii="Times New Roman" w:hAnsi="Times New Roman"/>
           <w:sz w:val="22"/>
         </w:rPr>
-        <w:t>10 thực đơn ngẫu nhiên với x ~ U(25, 350) trên cùng danh sách 8 món ăn.</w:t>
+        <w:t>10 thực đơn ngẫu nhiên với x ~ U(25, 350) trên cùng danh sách món ăn.</w:t>
       </w:r>
     </w:p>
     <w:p>
@@ -1710,7 +1694,7 @@
           <w:color w:val="232323"/>
           <w:sz w:val="22"/>
         </w:rPr>
-        <w:t>Dữ liệu thực nghiệm được xuất tự động ra 3 file CSV trong thư mục `experiments/week7/` bao gồm: `menu_runs.csv` (20 dòng dữ liệu chi tiết của từng run), `menu_summary.csv` (thống kê tổng hợp) và `menu_history.csv` (lịch sử hội tụ qua từng vòng lặp).</w:t>
+        <w:t>Dữ liệu thực nghiệm được xuất tự động ra các file CSV trong thư mục `experiments/week7/` bao gồm: `menu_runs.csv` (dữ liệu chi tiết từng run), `menu_summary.csv` (thống kê tổng hợp) và `menu_history.csv` (lịch sử hội tụ qua từng vòng lặp).</w:t>
       </w:r>
     </w:p>
     <w:p>
@@ -2108,7 +2092,7 @@
                 <w:rFonts w:ascii="Times New Roman" w:hAnsi="Times New Roman"/>
                 <w:sz w:val="19"/>
               </w:rPr>
-              <w:t>1.21s</w:t>
+              <w:t>0.77s</w:t>
             </w:r>
           </w:p>
         </w:tc>
@@ -2294,7 +2278,7 @@
                 <w:rFonts w:ascii="Times New Roman" w:hAnsi="Times New Roman"/>
                 <w:sz w:val="19"/>
               </w:rPr>
-              <w:t>0.96s</w:t>
+              <w:t>0.92s</w:t>
             </w:r>
           </w:p>
         </w:tc>
@@ -2352,7 +2336,7 @@
           <w:color w:val="5A5A5A"/>
           <w:sz w:val="19"/>
         </w:rPr>
-        <w:t>Bảng 5.1. So sánh hiệu năng DBO vs IDBO trên Profile P1 (M=10 runs, max_iter=200, N=30)</w:t>
+        <w:t>Bảng 5.1. So sánh hiệu năng DBO vs IDBO trên Profile P1 (M=10 runs)</w:t>
       </w:r>
     </w:p>
     <w:p>
@@ -3106,7 +3090,7 @@
           <w:rFonts w:ascii="Times New Roman" w:hAnsi="Times New Roman"/>
           <w:sz w:val="22"/>
         </w:rPr>
-        <w:t>Kết luận: HÒA. Giá trị fitness trung bình của DBO đạt 99.1533 (±0.0831) và IDBO đạt 99.1533 (±0.0831). Chênh lệch tương đối là 0.00%, hoàn toàn nằm dưới ngưỡng 1.0%. Cả hai thuật toán đều tìm thấy điểm tối ưu khẩu phần có độ chính xác tương đương nhau trên không gian 8 chiều liên tục.</w:t>
+        <w:t>Kết luận: HÒA (1%). Giá trị fitness trung bình của DBO đạt 99.1533 (±0.0831) và IDBO đạt 99.1533 (±0.0831). Chênh lệch tương đối là 0.00%, nằm dưới ngưỡng 1.0%. Cả hai thuật toán đều tìm thấy điểm tối ưu khẩu phần có độ chính xác cao trên không gian liên tục.</w:t>
       </w:r>
     </w:p>
     <w:p>
@@ -3127,7 +3111,7 @@
           <w:rFonts w:ascii="Times New Roman" w:hAnsi="Times New Roman"/>
           <w:sz w:val="22"/>
         </w:rPr>
-        <w:t>Kết quả ngẫu nhiên (10 mẫu khẩu phần phân bố đều x ~ U(25, 350)): số vi phạm trung bình là 2.70 vi phạm/thực đơn (điểm fitness trung bình chỉ đạt 47.22, năng lượng dư thừa lên tới 3376.8 kcal). Sau khi tối ưu bằng DBO/IDBO: số vi phạm trung bình giảm về đúng 0.00 vi phạm/thực đơn. Như vậy, thuật toán đã GIẢM TRIỆT ĐỂ 100% SỐ VI PHẠM (giảm 2.70 lỗi về 0 lỗi hoàn toàn).</w:t>
+        <w:t>Kết quả ngẫu nhiên (10 mẫu khẩu phần phân bố đều x ~ U(25, 350)): số vi phạm trung bình là 2.70 vi phạm/thực đơn (điểm fitness trung bình chỉ đạt 47.22, năng lượng đạt 3376.8 kcal). Sau khi tối ưu bằng DBO/IDBO: số vi phạm trung bình giảm về đúng 0.00 vi phạm/thực đơn. Thuật toán đã GIẢM TRIỆT ĐỂ 100% SỐ VI PHẠM (giảm 2.70 lỗi về 0 lỗi hoàn toàn).</w:t>
       </w:r>
     </w:p>
     <w:p>
@@ -3148,7 +3132,7 @@
           <w:rFonts w:ascii="Times New Roman" w:hAnsi="Times New Roman"/>
           <w:sz w:val="22"/>
         </w:rPr>
-        <w:t>Năng lượng trung bình của thực đơn đạt 2492.29 kcal/ngày so với mức mục tiêu chuẩn DRI là 2491.62 kcal/ngày. Độ lệch thực tế chỉ là +0.67 kcal, tương đương ĐỘ LỆCH CHỈ 0.027% (xấp xỉ 0.03%). Đây là độ khớp năng lượng gần như tuyệt đối, đáp ứng hoàn hảo yêu cầu khắt khe của chế độ ăn duy trì thể trọng.</w:t>
+        <w:t>Năng lượng trung bình của thực đơn đạt 2492.49 kcal/ngày so với mức mục tiêu chuẩn DRI là 2491.62 kcal/ngày. Độ lệch thực tế chỉ là 0.87 kcal, tương đương ĐỘ LỆCH CHỈ 0.035% (xấp xỉ 0.03%). Đây là độ khớp năng lượng gần như tuyệt đối, đáp ứng hoàn hảo yêu cầu khắt khe của chế độ ăn duy trì thể trọng.</w:t>
       </w:r>
     </w:p>
     <w:p>
@@ -3169,7 +3153,7 @@
           <w:rFonts w:ascii="Times New Roman" w:hAnsi="Times New Roman"/>
           <w:sz w:val="22"/>
         </w:rPr>
-        <w:t>Thời gian chạy trung bình của DBO gốc là 1.21 giây/run, trong khi IDBO là 0.96 giây/run. Trên bài toán thực tế này, IDBO không hề bị chậm hơn mà còn NHANH HƠN KHOẢNG 21.0% so với DBO gốc, nhờ cơ chế khởi động lại và nhiễu loạn giúp các cá thể nhanh chóng tập trung vào vùng biên khẩu phần hợp lý.</w:t>
+        <w:t>Thời gian chạy trung bình của DBO gốc là 0.77 giây/run, trong khi IDBO là 0.92 giây/run. IDBO chậm hơn 19.7% so với DBO gốc, cho thấy thuật toán vận hành rất nhẹ và ổn định.</w:t>
       </w:r>
     </w:p>
     <w:p>
@@ -3190,7 +3174,7 @@
           <w:rFonts w:ascii="Times New Roman" w:hAnsi="Times New Roman"/>
           <w:sz w:val="22"/>
         </w:rPr>
-        <w:t>Quan sát Hình 5.1 cho thấy đường cong fitness tăng trưởng rất dốc trong 30 vòng lặp đầu tiên (từ mức ban đầu ~81.65 vọt lên &gt;98.96). Sau đó, đường cong bắt đầu đi vào vùng bình nguyên (plateau) tại KHOẢNG VÒNG LẶP 50 (đạt 99.07). Từ vòng lặp 80 đến 200, đồ thị gần như nằm ngang hoàn toàn, giá trị fitness chỉ tinh chỉnh rất nhỏ ở hàng phần vạn. Điều này chứng minh thuật toán đã hội tụ vững chắc và 200 vòng lặp là hoàn toàn dư dả để tìm kiếm lời giải tối ưu.</w:t>
+        <w:t>Quan sát Hình 5.1 cho thấy đường cong fitness tăng trưởng rất dốc trong 30 vòng lặp đầu tiên. Sau đó, đường cong bắt đầu đi vào vùng bình nguyên (plateau) tại khoảng vòng lặp 50 (đạt &gt;99.0). Từ vòng lặp 80 đến 200, đồ thị gần như nằm ngang hoàn toàn. Điều này chứng minh thuật toán đã hội tụ vững chắc và số vòng lặp hiện tại là hoàn toàn đủ để tìm kiếm lời giải tối ưu.</w:t>
       </w:r>
     </w:p>
     <w:p>
@@ -3237,7 +3221,7 @@
           <w:color w:val="232323"/>
           <w:sz w:val="22"/>
         </w:rPr>
-        <w:t>2. So sánh hành vi DBO vs IDBO trong bài toán khẩu phần: Khác với các hàm benchmark đa cực phức tạp (như Rastrigin, Griewank ở số chiều 30, 50 nơi IDBO vượt trội rõ rệt), bài toán khẩu phần 8 chiều với danh sách món cố định có bề mặt hàm mục tiêu tương đối đơn hướng và lồi xung quanh điểm cân bằng năng lượng. Do đó, cả DBO và IDBO đều dễ dàng đạt tới điểm tối ưu toàn cục (fitness ~99.2). Cải tiến của IDBO sẽ phát huy vai trò quyết định hơn khi nhóm bước sang giai đoạn tối ưu hỗn hợp (đồng thời chọn món và chọn gram) ở các tuần tới.</w:t>
+        <w:t>2. So sánh hành vi DBO vs IDBO trong bài toán khẩu phần: Khác với các hàm benchmark đa cực phức tạp (như Rastrigin, Griewank ở số chiều 30, 50 nơi IDBO vượt trội rõ rệt), bài toán khẩu phần liên tục với danh sách món cố định có bề mặt hàm mục tiêu tương đối đơn hướng và lồi xung quanh điểm cân bằng năng lượng. Do đó, cả DBO và IDBO đều dễ dàng đạt tới điểm tối ưu toàn cục (fitness ~99.2). Cải tiến của IDBO sẽ phát huy vai trò quyết định hơn khi nhóm bước sang giai đoạn tối ưu hỗn hợp (đồng thời chọn món và chọn gram) ở các tuần tới.</w:t>
       </w:r>
     </w:p>
     <w:p>

</xml_diff>

<commit_message>
fix(report): fix benchmark claim and remove hardcoded values in week 7 reports
</commit_message>
<xml_diff>
--- a/docs/BaoCao_Tuan7.docx
+++ b/docs/BaoCao_Tuan7.docx
@@ -2092,7 +2092,7 @@
                 <w:rFonts w:ascii="Times New Roman" w:hAnsi="Times New Roman"/>
                 <w:sz w:val="19"/>
               </w:rPr>
-              <w:t>0.77s</w:t>
+              <w:t>0.59s</w:t>
             </w:r>
           </w:p>
         </w:tc>
@@ -2278,7 +2278,7 @@
                 <w:rFonts w:ascii="Times New Roman" w:hAnsi="Times New Roman"/>
                 <w:sz w:val="19"/>
               </w:rPr>
-              <w:t>0.92s</w:t>
+              <w:t>0.70s</w:t>
             </w:r>
           </w:p>
         </w:tc>
@@ -3111,7 +3111,7 @@
           <w:rFonts w:ascii="Times New Roman" w:hAnsi="Times New Roman"/>
           <w:sz w:val="22"/>
         </w:rPr>
-        <w:t>Kết quả ngẫu nhiên (10 mẫu khẩu phần phân bố đều x ~ U(25, 350)): số vi phạm trung bình là 2.70 vi phạm/thực đơn (điểm fitness trung bình chỉ đạt 47.22, năng lượng đạt 3376.8 kcal). Sau khi tối ưu bằng DBO/IDBO: số vi phạm trung bình giảm về đúng 0.00 vi phạm/thực đơn. Thuật toán đã GIẢM TRIỆT ĐỂ 100% SỐ VI PHẠM (giảm 2.70 lỗi về 0 lỗi hoàn toàn).</w:t>
+        <w:t>Kết quả ngẫu nhiên (10 mẫu khẩu phần phân bố đều x ~ U(25, 350)): số vi phạm trung bình là 2.70 vi phạm/thực đơn (điểm fitness trung bình chỉ đạt 47.22, năng lượng đạt 3376.8 kcal). Sau khi tối ưu bằng DBO/IDBO: số vi phạm trung bình còn 0.00 vi phạm/thực đơn. Mức giảm so với thực đơn ngẫu nhiên là 2.70 vi phạm/thực đơn.</w:t>
       </w:r>
     </w:p>
     <w:p>
@@ -3153,7 +3153,7 @@
           <w:rFonts w:ascii="Times New Roman" w:hAnsi="Times New Roman"/>
           <w:sz w:val="22"/>
         </w:rPr>
-        <w:t>Thời gian chạy trung bình của DBO gốc là 0.77 giây/run, trong khi IDBO là 0.92 giây/run. IDBO chậm hơn 19.7% so với DBO gốc, cho thấy thuật toán vận hành rất nhẹ và ổn định.</w:t>
+        <w:t>Thời gian chạy trung bình của DBO gốc là 0.59 giây/run, trong khi IDBO là 0.70 giây/run. IDBO chậm hơn 20.0% so với DBO gốc, cho thấy thuật toán vận hành rất nhẹ và ổn định.</w:t>
       </w:r>
     </w:p>
     <w:p>
@@ -3174,7 +3174,7 @@
           <w:rFonts w:ascii="Times New Roman" w:hAnsi="Times New Roman"/>
           <w:sz w:val="22"/>
         </w:rPr>
-        <w:t>Quan sát Hình 5.1 cho thấy đường cong fitness tăng trưởng rất dốc trong 30 vòng lặp đầu tiên. Sau đó, đường cong bắt đầu đi vào vùng bình nguyên (plateau) tại khoảng vòng lặp 50 (đạt &gt;99.0). Từ vòng lặp 80 đến 200, đồ thị gần như nằm ngang hoàn toàn. Điều này chứng minh thuật toán đã hội tụ vững chắc và số vòng lặp hiện tại là hoàn toàn đủ để tìm kiếm lời giải tối ưu.</w:t>
+        <w:t>Quan sát Hình 5.1, đường cong fitness tăng nhanh trong các vòng lặp đầu và đạt ~99% giá trị cuối (99.1533) quanh vòng lặp 10. Từ đó đến vòng lặp 200, đồ thị gần như đi ngang, cho thấy thuật toán đã hội tụ ổn định và max_iter hiện tại là đủ.</w:t>
       </w:r>
     </w:p>
     <w:p>
@@ -3221,7 +3221,7 @@
           <w:color w:val="232323"/>
           <w:sz w:val="22"/>
         </w:rPr>
-        <w:t>2. So sánh hành vi DBO vs IDBO trong bài toán khẩu phần: Khác với các hàm benchmark đa cực phức tạp (như Rastrigin, Griewank ở số chiều 30, 50 nơi IDBO vượt trội rõ rệt), bài toán khẩu phần liên tục với danh sách món cố định có bề mặt hàm mục tiêu tương đối đơn hướng và lồi xung quanh điểm cân bằng năng lượng. Do đó, cả DBO và IDBO đều dễ dàng đạt tới điểm tối ưu toàn cục (fitness ~99.2). Cải tiến của IDBO sẽ phát huy vai trò quyết định hơn khi nhóm bước sang giai đoạn tối ưu hỗn hợp (đồng thời chọn món và chọn gram) ở các tuần tới.</w:t>
+        <w:t>2. So sánh hành vi DBO vs IDBO trong bài toán khẩu phần: Trên 6 hàm benchmark chuẩn ở tuần 5-6, IDBO và DBO cho kết quả hòa trên toàn bộ 18/18 cấu hình (hàm × dim, ngưỡng 1%). Với bài toán khẩu phần liên tục có danh sách món cố định, bề mặt hàm mục tiêu tương đối đơn hướng và lồi quanh điểm cân bằng năng lượng, nên cả DBO và IDBO đều đạt tới điểm tối ưu toàn cục (fitness ~99.15). Vai trò của cơ chế cải tiến trong IDBO sẽ thể hiện rõ hơn khi nhóm chuyển sang tối ưu hỗn hợp (đồng thời chọn món và chọn gram) ở các tuần tới.</w:t>
       </w:r>
     </w:p>
     <w:p>

</xml_diff>